<commit_message>
feat(write): marcador de imagem — Definir Novo Marcador › Imagem, desenhado como o Word (JS e .NET)
- Oráculo (home-lab exp-picbullet.ps1): o Word grava w:numPicBullet com VML
  (v:shapetype _x0000_t75 + v:shape o:bullet com o tamanho natural e
  v:imagedata pela relação da parte de numeração), o nível com numFmt bullet,
  lvlText U+F0B7 (Symbol) e w:lvlPicBulletId; no PDF a figura tem altura =
  corpo do nível − 2 pt (6→4, 8→6, 11→9, 14→12, 30→28, 48→46), largura pela
  proporção, o pé na linha de base e a altura na ascendente da linha.
- docx-core: a imagem do marcador pela relação da numeração (numberingImages),
  tamanho do estilo VML em pt/in/px/cm/mm.
- docx-layout e OfficeNext.DocxLayout: o marcador vira a figura (antes saía o
  caractere de reserva); paridade no texteffects.docx.
- Editor: defineListLevel({ picture }) grava o w:numPicBullet, a mídia, a
  relação e o tipo; botão Imagem... no Definir Novo Marcador.

Co-Authored-By: Claude Opus 5.5 <noreply@anthropic.com>
</commit_message>
<xml_diff>
--- a/dotnet/tests/fixtures/input/texteffects.docx
+++ b/dotnet/tests/fixtures/input/texteffects.docx
@@ -245,6 +245,30 @@
         <w:t xml:space="preserve"> calt office</w:t>
       </w:r>
     </w:p>
+    <w:p>
+      <w:pPr>
+        <w:numPr>
+          <w:ilvl w:val="0"/>
+          <w:numId w:val="1"/>
+        </w:numPr>
+        <w:ind w:left="720" w:hanging="360"/>
+      </w:pPr>
+      <w:r>
+        <w:t xml:space="preserve">Item com marcador de imagem</w:t>
+      </w:r>
+    </w:p>
+    <w:p>
+      <w:pPr>
+        <w:numPr>
+          <w:ilvl w:val="0"/>
+          <w:numId w:val="1"/>
+        </w:numPr>
+        <w:ind w:left="720" w:hanging="360"/>
+      </w:pPr>
+      <w:r>
+        <w:t xml:space="preserve">Outro item</w:t>
+      </w:r>
+    </w:p>
     <w:sectPr>
       <w:pgSz w:w="11906" w:h="16838"/>
       <w:pgMar w:top="1417" w:right="1701" w:bottom="1417" w:left="1701" w:header="708" w:footer="708" w:gutter="0"/>
@@ -253,6 +277,38 @@
     </w:sectPr>
   </w:body>
 </w:document>
+</file>
+
+<file path=word/numbering.xml><?xml version="1.0" encoding="utf-8"?>
+<w:numbering xmlns:w="http://schemas.openxmlformats.org/wordprocessingml/2006/main" xmlns:r="http://schemas.openxmlformats.org/officeDocument/2006/relationships" xmlns:wp="http://schemas.openxmlformats.org/drawingml/2006/wordprocessingDrawing" xmlns:a="http://schemas.openxmlformats.org/drawingml/2006/main" xmlns:pic="http://schemas.openxmlformats.org/drawingml/2006/picture" xmlns:wps="http://schemas.microsoft.com/office/word/2010/wordprocessingShape" xmlns:mc="http://schemas.openxmlformats.org/markup-compatibility/2006" xmlns:v="urn:schemas-microsoft-com:vml" xmlns:o="urn:schemas-microsoft-com:office:office" xmlns:w10="urn:schemas-microsoft-com:office:word" xmlns:w14="http://schemas.microsoft.com/office/word/2010/wordml">
+  <w:numPicBullet w:numPicBulletId="0">
+    <w:pict>
+      <v:shape id="_x0000_i1025" type="#_x0000_t75" style="width:5in;height:270pt" o:bullet="t">
+        <v:imagedata r:id="rIdPb1" o:title="bullet"/>
+      </v:shape>
+    </w:pict>
+  </w:numPicBullet>
+  <w:abstractNum w:abstractNumId="0">
+    <w:multiLevelType w:val="singleLevel"/>
+    <w:lvl w:ilvl="0">
+      <w:start w:val="1"/>
+      <w:numFmt w:val="bullet"/>
+      <w:lvlText w:val=""/>
+      <w:lvlPicBulletId w:val="0"/>
+      <w:lvlJc w:val="left"/>
+      <w:pPr>
+        <w:ind w:left="720" w:hanging="360"/>
+      </w:pPr>
+      <w:rPr>
+        <w:rFonts w:ascii="Symbol" w:hAnsi="Symbol" w:hint="default"/>
+        <w:sz w:val="28"/>
+      </w:rPr>
+    </w:lvl>
+  </w:abstractNum>
+  <w:num w:numId="1">
+    <w:abstractNumId w:val="0"/>
+  </w:num>
+</w:numbering>
 </file>
 
 <file path=word/styles.xml><?xml version="1.0" encoding="utf-8"?>

</xml_diff>